<commit_message>
docs: clarify digital attendance confirmation workflow and document QR verification
</commit_message>
<xml_diff>
--- a/docs/dokumen_arsitektur_sistem_sibima.docx
+++ b/docs/dokumen_arsitektur_sistem_sibima.docx
@@ -584,7 +584,7 @@
           <w:sz w:val="19"/>
           <w:szCs w:val="19"/>
         </w:rPr>
-        <w:t xml:space="preserve">Sistem Informasi Bimbingan Mahasiswa (**SIBIMA**) adalah platform sentral tata kelola siklus hidup akademik Tugas Akhir dan Skripsi pada Fakultas Ilmu Komputer (FASILKOM) Universitas Subang. SIBIMA mengotomatisasi rantai proses administrasi dan akademik secara menyeluruhâ€”mulai dari pengajuan judul, alokasi dosen pembimbing, sesi bimbingan berbasis QR-code, logbook kemajuan berkas bab, pendaftaran ujian seminar proposal, pelaksanaan seminar, pencatatan revisi bertingkat, pendaftaran sidang skripsi, pelaksanaan sidang dewan penguji, penuntasan revisi sidang, yudisium kelulusan, penomoran Berita Acara resmi, penerbitan Surat Keputusan (SK) Dekan, hingga katalog repositori digital karya ilmiah alumni dan federasi pencarian jurnal internasional.</w:t>
+        <w:t xml:space="preserve">Sistem Informasi Bimbingan Mahasiswa (**SIBIMA**) adalah platform sentral tata kelola siklus hidup akademik Tugas Akhir dan Skripsi pada Fakultas Ilmu Komputer (FASILKOM) Universitas Subang. SIBIMA mengotomatisasi rantai proses administrasi dan akademik secara menyeluruhâ€”mulai dari pengajuan judul, alokasi dosen pembimbing, sesi bimbingan terverifikasi digital ber-QR Code tanda tangan resmi, logbook kemajuan berkas bab, pendaftaran ujian seminar proposal, pelaksanaan seminar, pencatatan revisi bertingkat, pendaftaran sidang skripsi, pelaksanaan sidang dewan penguji, penuntasan revisi sidang, yudisium kelulusan, penomoran Berita Acara resmi, penerbitan Surat Keputusan (SK) Dekan, hingga katalog repositori digital karya ilmiah alumni dan federasi pencarian jurnal internasional.</w:t>
       </w:r>
     </w:p>
     <w:p>
@@ -937,7 +937,7 @@
                 <w:b w:val="0"/>
                 <w:bCs w:val="0"/>
               </w:rPr>
-              <w:t xml:space="preserve">Mengajukan judul tugas akhir, mengisi logbook harian, membuat janji bimbingan, melakukan presensi bimbingan via scan QR Code, mendaftar Seminar Proposal &amp; Sidang Skripsi, mengunggah revisi naskah, mengajukan yudisium, serta menelusuri katalog pustaka dan jurnal.</w:t>
+              <w:t xml:space="preserve">Mengajukan judul tugas akhir, mengisi logbook harian, membuat janji bimbingan, melakukan konfirmasi kehadiran bimbingan digital, mendaftar Seminar Proposal &amp; Sidang Skripsi, mengunggah revisi naskah, mengajukan yudisium, serta menelusuri katalog pustaka dan jurnal.</w:t>
             </w:r>
           </w:p>
         </w:tc>
@@ -986,7 +986,7 @@
                 <w:b w:val="0"/>
                 <w:bCs w:val="0"/>
               </w:rPr>
-              <w:t xml:space="preserve">Menyetujui/menolak pengajuan judul, mengelola jadwal bimbingan tatap muka/online, menerbitkan QR Code presensi bimbingan, memberikan paraf digital &amp; catatan perbaikan bab, menyetujui kelayakan pendaftaran ujian, serta memvalidasi revisi akhir naskah.</w:t>
+              <w:t xml:space="preserve">Menyetujui/menolak pengajuan judul, mengelola jadwal bimbingan tatap muka/online, memvalidasi kehadiran dan menyelesaikan sesi bimbingan, memberikan paraf digital &amp; catatan perbaikan bab, menyetujui kelayakan pendaftaran ujian, serta memvalidasi revisi akhir naskah.</w:t>
             </w:r>
           </w:p>
         </w:tc>
@@ -4475,7 +4475,7 @@
           <w:sz w:val="19"/>
           <w:szCs w:val="19"/>
         </w:rPr>
-        <w:t xml:space="preserve">Mahasiswa memindai QR Code menggunakan kamera ponsel untuk memvalidasi kehadiran secara instan.</w:t>
+        <w:t xml:space="preserve">Mahasiswa melakukan konfirmasi kehadiran (Hadir/Izin), lalu dosen memvalidasi pelaksanaan bimbingan dan menandai status sesi Selesai (Completed).</w:t>
       </w:r>
     </w:p>
     <w:p>
@@ -6451,7 +6451,7 @@
                 <w:sz w:val="17"/>
                 <w:szCs w:val="17"/>
               </w:rPr>
-              <w:t xml:space="preserve">    MS--&gt;&gt;UI_D: Tampilkan Layar QR Code Dinamis</w:t>
+              <w:t xml:space="preserve">    MS--&gt;&gt;UI_D: Sesi Bimbingan Aktif &amp; Notifikasi Terkirim</w:t>
             </w:r>
           </w:p>
           <w:p>
@@ -6493,7 +6493,7 @@
                 <w:sz w:val="17"/>
                 <w:szCs w:val="17"/>
               </w:rPr>
-              <w:t xml:space="preserve">    M-&gt;&gt;UI_D: Pindai QR Code dengan Kamera Ponsel</w:t>
+              <w:t xml:space="preserve">    M-&gt;&gt;UI_M: Klik Konfirmasi Hadir</w:t>
             </w:r>
           </w:p>
           <w:p>
@@ -14626,7 +14626,7 @@
 <file path=word/numbering.xml><?xml version="1.0" encoding="utf-8"?>
 <w:numbering xmlns:ve="http://schemas.openxmlformats.org/markup-compatibility/2006" xmlns:o="urn:schemas-microsoft-com:office:office" xmlns:r="http://schemas.openxmlformats.org/officeDocument/2006/relationships" xmlns:m="http://schemas.openxmlformats.org/officeDocument/2006/math" xmlns:v="urn:schemas-microsoft-com:vml" xmlns:wp="http://schemas.openxmlformats.org/drawingml/2006/wordprocessingDrawing" xmlns:w10="urn:schemas-microsoft-com:office:word" xmlns:w="http://schemas.openxmlformats.org/wordprocessingml/2006/main" xmlns:wne="http://schemas.microsoft.com/office/word/2006/wordml">
   <w:abstractNum w:abstractNumId="4">
-    <w:nsid w:val="BE8B1EF2"/>
+    <w:nsid w:val="05A39CCB"/>
     <w:multiLevelType w:val="hybridMultilevel"/>
     <w:lvl w:ilvl="0">
       <w:start w:val="1"/>

</xml_diff>